<commit_message>
perbaikan bug, kolom n_aksesibilitas_inv
</commit_message>
<xml_diff>
--- a/docs/PRD_GeoTransitInsight.docx
+++ b/docs/PRD_GeoTransitInsight.docx
@@ -1264,7 +1264,7 @@
       </w:r>
       <w:proofErr w:type="spellEnd"/>
       <w:r>
-        <w:t xml:space="preserve"> 2.595.927 </w:t>
+        <w:t xml:space="preserve"> 2.607.248 </w:t>
       </w:r>
       <w:proofErr w:type="spellStart"/>
       <w:r>
@@ -1296,7 +1296,7 @@
       </w:r>
       <w:proofErr w:type="spellEnd"/>
       <w:r>
-        <w:t xml:space="preserve"> 12.333 </w:t>
+        <w:t xml:space="preserve"> 12.387 </w:t>
       </w:r>
       <w:proofErr w:type="spellStart"/>
       <w:r>
@@ -1304,7 +1304,7 @@
       </w:r>
       <w:proofErr w:type="spellEnd"/>
       <w:r>
-        <w:t xml:space="preserve">/km², </w:t>
+        <w:t xml:space="preserve">/km² (DKB Semester 1 2026), </w:t>
       </w:r>
       <w:proofErr w:type="spellStart"/>
       <w:r>

</xml_diff>